<commit_message>
docs(pilot): reframe pilot doc for no-Yandex reality
Yandex is unavailable for now, so the pilot doc no longer over-promises phones:
- value reframed to "targeted company list + scoring + export", contacts
  "from open sources / where the company has a website";
- removed all Yandex mentions (intro, trial terms, sources, pricing table);
- honest "контакты есть не у всех" note; pricing table differentiates on
  volume/projects/team (sources are the same on all plans now);
- feedback question reworded around list usefulness, not just phone coverage.
</commit_message>
<xml_diff>
--- a/docs/БАЗА-пилот.docx
+++ b/docs/БАЗА-пилот.docx
@@ -35,13 +35,13 @@
         <w:t xml:space="preserve"> </w:t>
       </w:r>
       <w:r>
-        <w:t xml:space="preserve">(usebaza.ru) превращает текстовое описание «кого вы ищете» в готовую базу</w:t>
-      </w:r>
-      <w:r>
-        <w:t xml:space="preserve"> </w:t>
-      </w:r>
-      <w:r>
-        <w:t xml:space="preserve">B2B-лидов с контактами и оценкой релевантности.</w:t>
+        <w:t xml:space="preserve">(usebaza.ru) превращает текстовое описание «кого вы ищете» в целевой</w:t>
+      </w:r>
+      <w:r>
+        <w:t xml:space="preserve"> </w:t>
+      </w:r>
+      <w:r>
+        <w:t xml:space="preserve">список B2B-компаний с приоритизацией по релевантности и контактами из открытых источников.</w:t>
       </w:r>
       <w:r>
         <w:t xml:space="preserve"> </w:t>
@@ -122,7 +122,7 @@
         <w:t xml:space="preserve">25 000 лидов/мес</w:t>
       </w:r>
       <w:r>
-        <w:t xml:space="preserve">, до 20 проектов, все источники (включая Яндекс Карты), AI-разбор запроса, экспорт и выгрузка в CRM.</w:t>
+        <w:t xml:space="preserve">, до 20 проектов, источники 2ГИС · ЕГРЮЛ · веб-поиск, AI-разбор запроса, экспорт и выгрузка в CRM.</w:t>
       </w:r>
     </w:p>
     <w:p>
@@ -211,7 +211,7 @@
         </w:numPr>
       </w:pPr>
       <w:r>
-        <w:t xml:space="preserve">находит email, телефон, адрес и проверяет их;</w:t>
+        <w:t xml:space="preserve">подтягивает адрес и контакты (email/телефон) — там, где они есть в открытых источниках или на сайте компании;</w:t>
       </w:r>
     </w:p>
     <w:p>
@@ -450,7 +450,7 @@
         <w:t xml:space="preserve"> </w:t>
       </w:r>
       <w:r>
-        <w:t xml:space="preserve">(или по выбранным строкам в режиме «Таблица»). У лидов появятся email (со значком проверки), телефон, адрес.</w:t>
+        <w:t xml:space="preserve">(или по выбранным строкам в режиме «Таблица»). Где у компании есть сайт — подтянутся email/телефон (email с проверкой доставляемости); адрес и категория есть почти всегда.</w:t>
       </w:r>
     </w:p>
     <w:p>
@@ -547,7 +547,7 @@
         <w:t xml:space="preserve"> </w:t>
       </w:r>
       <w:r>
-        <w:t xml:space="preserve">2ГИС (основной по РФ), Яндекс Карты, ЕГРЮЛ/Rusprofile (юрлица, ИНН), веб-поиск. Найденные компании попадают в общий «склад», поэтому повторные сборы быстрее и дешевле.</w:t>
+        <w:t xml:space="preserve">2ГИС (основной по РФ), ЕГРЮЛ/Rusprofile (юрлица, ИНН), веб-поиск. Найденные компании попадают в общий «склад», поэтому повторные сборы быстрее и дешевле.</w:t>
       </w:r>
     </w:p>
     <w:p>
@@ -798,13 +798,45 @@
           <w:b/>
           <w:bCs/>
         </w:rPr>
-        <w:t xml:space="preserve">Контакты — только из открытых источников.</w:t>
-      </w:r>
-      <w:r>
-        <w:t xml:space="preserve"> </w:t>
-      </w:r>
-      <w:r>
-        <w:t xml:space="preserve">Если у компании нет публичного email/телефона, поле останется пустым («—»). БАЗА не выдумывает контакты.</w:t>
+        <w:t xml:space="preserve">Контакты есть не у всех — и это нормально.</w:t>
+      </w:r>
+      <w:r>
+        <w:t xml:space="preserve"> </w:t>
+      </w:r>
+      <w:r>
+        <w:t xml:space="preserve">Главная сила БАЗА —</w:t>
+      </w:r>
+      <w:r>
+        <w:t xml:space="preserve"> </w:t>
+      </w:r>
+      <w:r>
+        <w:rPr>
+          <w:i/>
+          <w:iCs/>
+        </w:rPr>
+        <w:t xml:space="preserve">находить и приоритизировать</w:t>
+      </w:r>
+      <w:r>
+        <w:t xml:space="preserve"> </w:t>
+      </w:r>
+      <w:r>
+        <w:t xml:space="preserve">нужные компании по нише/гео/ОКВЭД. Email и телефон подтягиваются там, где у компании есть публичный сайт; у части компаний (особенно небольших локальных) контактов в открытом доступе нет — тогда остаются название, адрес, категория, ИНН и score, а контакт можно добрать вручную. БАЗА</w:t>
+      </w:r>
+      <w:r>
+        <w:t xml:space="preserve"> </w:t>
+      </w:r>
+      <w:r>
+        <w:rPr>
+          <w:b/>
+          <w:bCs/>
+        </w:rPr>
+        <w:t xml:space="preserve">не выдумывает</w:t>
+      </w:r>
+      <w:r>
+        <w:t xml:space="preserve"> </w:t>
+      </w:r>
+      <w:r>
+        <w:t xml:space="preserve">контакты.</w:t>
       </w:r>
     </w:p>
     <w:p>
@@ -901,17 +933,15 @@
     <w:tbl>
       <w:tblPr>
         <w:tblStyle w:val="Table"/>
-        <w:tblW w:type="pct" w:w="5000"/>
-        <w:tblLayout w:type="fixed"/>
+        <w:tblW w:type="auto" w:w="0"/>
         <w:tblLook w:firstRow="1" w:lastRow="0" w:firstColumn="0" w:lastColumn="0" w:noHBand="0" w:noVBand="0" w:val="0020"/>
       </w:tblPr>
       <w:tblGrid>
-        <w:gridCol w:w="1320"/>
-        <w:gridCol w:w="1320"/>
-        <w:gridCol w:w="1320"/>
-        <w:gridCol w:w="1320"/>
-        <w:gridCol w:w="1320"/>
-        <w:gridCol w:w="1320"/>
+        <w:gridCol w:w="1584"/>
+        <w:gridCol w:w="1584"/>
+        <w:gridCol w:w="1584"/>
+        <w:gridCol w:w="1584"/>
+        <w:gridCol w:w="1584"/>
       </w:tblGrid>
       <w:tr>
         <w:trPr>
@@ -972,17 +1002,6 @@
             </w:r>
           </w:p>
         </w:tc>
-        <w:tc>
-          <w:tcPr/>
-          <w:p>
-            <w:pPr>
-              <w:pStyle w:val="Compact"/>
-            </w:pPr>
-            <w:r>
-              <w:t xml:space="preserve">Источники</w:t>
-            </w:r>
-          </w:p>
-        </w:tc>
       </w:tr>
       <w:tr>
         <w:tc>
@@ -1037,17 +1056,6 @@
             </w:pPr>
             <w:r>
               <w:t xml:space="preserve">✅</w:t>
-            </w:r>
-          </w:p>
-        </w:tc>
-        <w:tc>
-          <w:tcPr/>
-          <w:p>
-            <w:pPr>
-              <w:pStyle w:val="Compact"/>
-            </w:pPr>
-            <w:r>
-              <w:t xml:space="preserve">2ГИС · ЕГРЮЛ · веб</w:t>
             </w:r>
           </w:p>
         </w:tc>
@@ -1122,17 +1130,6 @@
             </w:r>
           </w:p>
         </w:tc>
-        <w:tc>
-          <w:tcPr/>
-          <w:p>
-            <w:pPr>
-              <w:pStyle w:val="Compact"/>
-            </w:pPr>
-            <w:r>
-              <w:t xml:space="preserve">+ Яндекс Карты</w:t>
-            </w:r>
-          </w:p>
-        </w:tc>
       </w:tr>
       <w:tr>
         <w:tc>
@@ -1190,17 +1187,6 @@
             </w:r>
           </w:p>
         </w:tc>
-        <w:tc>
-          <w:tcPr/>
-          <w:p>
-            <w:pPr>
-              <w:pStyle w:val="Compact"/>
-            </w:pPr>
-            <w:r>
-              <w:t xml:space="preserve">всё</w:t>
-            </w:r>
-          </w:p>
-        </w:tc>
       </w:tr>
     </w:tbl>
     <w:p>
@@ -1208,7 +1194,7 @@
         <w:pStyle w:val="BodyText"/>
       </w:pPr>
       <w:r>
-        <w:t xml:space="preserve">Оплата — через</w:t>
+        <w:t xml:space="preserve">Источники (2ГИС · ЕГРЮЛ · веб-поиск) и обогащение доступны на всех тарифах; планы отличаются объёмом лидов, числом проектов и команды. Оплата — через</w:t>
       </w:r>
       <w:r>
         <w:t xml:space="preserve"> </w:t>
@@ -1224,7 +1210,7 @@
         <w:t xml:space="preserve"> </w:t>
       </w:r>
       <w:r>
-        <w:t xml:space="preserve">(РФ). На каждом тарифе действует месячный бюджет на AI-обработку. Во время пилота ничего не списывается — он просто закончится через 14 дней, и вы сами решите, продолжать ли.</w:t>
+        <w:t xml:space="preserve">(РФ); на каждом тарифе действует месячный бюджет на AI-обработку. Во время пилота ничего не списывается — он просто закончится через 14 дней, и вы сами решите, продолжать ли.</w:t>
       </w:r>
     </w:p>
     <w:p>
@@ -1306,7 +1292,7 @@
         <w:t xml:space="preserve"> </w:t>
       </w:r>
       <w:r>
-        <w:t xml:space="preserve">— какая доля лидов с рабочим email/телефоном? Удалось дозвониться/написать?</w:t>
+        <w:t xml:space="preserve">— у какой доли лидов нашёлся рабочий email/телефон? Достаточно ли списка + адресов там, где контактов нет?</w:t>
       </w:r>
     </w:p>
     <w:p>

</xml_diff>

<commit_message>
docs(pilot): phones are back — measured 50-70% with phone at collection (Yandex trial)
</commit_message>
<xml_diff>
--- a/docs/БАЗА-пилот.docx
+++ b/docs/БАЗА-пилот.docx
@@ -41,13 +41,13 @@
         <w:t xml:space="preserve"> </w:t>
       </w:r>
       <w:r>
-        <w:t xml:space="preserve">список B2B-компаний с приоритизацией по релевантности и контактами из открытых источников.</w:t>
-      </w:r>
-      <w:r>
-        <w:t xml:space="preserve"> </w:t>
-      </w:r>
-      <w:r>
-        <w:t xml:space="preserve">Оператор — ООО «ПРО ЛЕС». Данные хранятся в РФ (152-ФЗ).</w:t>
+        <w:t xml:space="preserve">список B2B-компаний с телефонами и сайтами у большинства лидов, email-обогащением</w:t>
+      </w:r>
+      <w:r>
+        <w:t xml:space="preserve"> </w:t>
+      </w:r>
+      <w:r>
+        <w:t xml:space="preserve">и приоритизацией по релевантности. Оператор — ООО «ПРО ЛЕС». Данные хранятся в РФ (152-ФЗ).</w:t>
       </w:r>
     </w:p>
     <w:p>
@@ -122,7 +122,7 @@
         <w:t xml:space="preserve">25 000 лидов/мес</w:t>
       </w:r>
       <w:r>
-        <w:t xml:space="preserve">, до 20 проектов, источники 2ГИС · ЕГРЮЛ · веб-поиск, AI-разбор запроса, экспорт и выгрузка в CRM.</w:t>
+        <w:t xml:space="preserve">, до 20 проектов, источники Яндекс Карты · 2ГИС · ЕГРЮЛ · веб-поиск, AI-разбор запроса, экспорт и выгрузка в CRM.</w:t>
       </w:r>
     </w:p>
     <w:p>
@@ -211,7 +211,23 @@
         </w:numPr>
       </w:pPr>
       <w:r>
-        <w:t xml:space="preserve">подтягивает адрес и контакты (email/телефон) — там, где они есть в открытых источниках или на сайте компании;</w:t>
+        <w:t xml:space="preserve">подтягивает телефон, сайт и адрес прямо при сборе (по нашим замерам телефон находится у</w:t>
+      </w:r>
+      <w:r>
+        <w:t xml:space="preserve"> </w:t>
+      </w:r>
+      <w:r>
+        <w:rPr>
+          <w:b/>
+          <w:bCs/>
+        </w:rPr>
+        <w:t xml:space="preserve">50–70% лидов</w:t>
+      </w:r>
+      <w:r>
+        <w:t xml:space="preserve"> </w:t>
+      </w:r>
+      <w:r>
+        <w:t xml:space="preserve">сразу), а email добирает с сайта компании;</w:t>
       </w:r>
     </w:p>
     <w:p>
@@ -547,7 +563,7 @@
         <w:t xml:space="preserve"> </w:t>
       </w:r>
       <w:r>
-        <w:t xml:space="preserve">2ГИС (основной по РФ), ЕГРЮЛ/Rusprofile (юрлица, ИНН), веб-поиск. Найденные компании попадают в общий «склад», поэтому повторные сборы быстрее и дешевле.</w:t>
+        <w:t xml:space="preserve">Яндекс Карты (основной источник телефонов и сайтов), 2ГИС (охват по РФ), ЕГРЮЛ/Rusprofile (юрлица, ИНН), веб-поиск (email с сайтов). Найденные компании попадают в общий «склад», поэтому повторные сборы быстрее и дешевле.</w:t>
       </w:r>
     </w:p>
     <w:p>
@@ -798,29 +814,26 @@
           <w:b/>
           <w:bCs/>
         </w:rPr>
-        <w:t xml:space="preserve">Контакты есть не у всех — и это нормально.</w:t>
-      </w:r>
-      <w:r>
-        <w:t xml:space="preserve"> </w:t>
-      </w:r>
-      <w:r>
-        <w:t xml:space="preserve">Главная сила БАЗА —</w:t>
-      </w:r>
-      <w:r>
-        <w:t xml:space="preserve"> </w:t>
-      </w:r>
-      <w:r>
-        <w:rPr>
-          <w:i/>
-          <w:iCs/>
-        </w:rPr>
-        <w:t xml:space="preserve">находить и приоритизировать</w:t>
-      </w:r>
-      <w:r>
-        <w:t xml:space="preserve"> </w:t>
-      </w:r>
-      <w:r>
-        <w:t xml:space="preserve">нужные компании по нише/гео/ОКВЭД. Email и телефон подтягиваются там, где у компании есть публичный сайт; у части компаний (особенно небольших локальных) контактов в открытом доступе нет — тогда остаются название, адрес, категория, ИНН и score, а контакт можно добрать вручную. БАЗА</w:t>
+        <w:t xml:space="preserve">Контакты есть у большинства, но не у всех.</w:t>
+      </w:r>
+      <w:r>
+        <w:t xml:space="preserve"> </w:t>
+      </w:r>
+      <w:r>
+        <w:t xml:space="preserve">По нашим замерам телефон приходит сразу у</w:t>
+      </w:r>
+      <w:r>
+        <w:t xml:space="preserve"> </w:t>
+      </w:r>
+      <w:r>
+        <w:rPr>
+          <w:b/>
+          <w:bCs/>
+        </w:rPr>
+        <w:t xml:space="preserve">50–70% лидов</w:t>
+      </w:r>
+      <w:r>
+        <w:t xml:space="preserve">, сайт — у ~половины (с него добирается email). У части компаний контактов в открытом доступе нет — тогда остаются название, адрес, категория, ИНН и score, а контакт можно добрать вручную. БАЗА</w:t>
       </w:r>
       <w:r>
         <w:t xml:space="preserve"> </w:t>
@@ -836,7 +849,7 @@
         <w:t xml:space="preserve"> </w:t>
       </w:r>
       <w:r>
-        <w:t xml:space="preserve">контакты.</w:t>
+        <w:t xml:space="preserve">контакты — только реальные данные из открытых источников.</w:t>
       </w:r>
     </w:p>
     <w:p>
@@ -1194,7 +1207,20 @@
         <w:pStyle w:val="BodyText"/>
       </w:pPr>
       <w:r>
-        <w:t xml:space="preserve">Источники (2ГИС · ЕГРЮЛ · веб-поиск) и обогащение доступны на всех тарифах; планы отличаются объёмом лидов, числом проектов и команды. Оплата — через</w:t>
+        <w:t xml:space="preserve">2ГИС · ЕГРЮЛ · веб-поиск и обогащение доступны на всех тарифах;</w:t>
+      </w:r>
+      <w:r>
+        <w:t xml:space="preserve"> </w:t>
+      </w:r>
+      <w:r>
+        <w:rPr>
+          <w:b/>
+          <w:bCs/>
+        </w:rPr>
+        <w:t xml:space="preserve">Яндекс Карты (телефоны/сайты при сборе) — на Pro и Business</w:t>
+      </w:r>
+      <w:r>
+        <w:t xml:space="preserve">. Планы отличаются объёмом лидов, числом проектов и команды. Оплата — через</w:t>
       </w:r>
       <w:r>
         <w:t xml:space="preserve"> </w:t>

</xml_diff>